<commit_message>
docs -- SI: finish lab 2
</commit_message>
<xml_diff>
--- a/42SI Stvorennja IDE/2/SI_KNT-122_Onyshchenko_19_PR2.docx
+++ b/42SI Stvorennja IDE/2/SI_KNT-122_Onyshchenko_19_PR2.docx
@@ -9227,6 +9227,121 @@
           <w:color w:val="auto"/>
         </w:rPr>
         <w:t>Питання</w:t>
+      </w:r>
+    </w:p>
+    <w:p>
+      <w:pPr>
+        <w:pStyle w:val="H2"/>
+        <w:rPr/>
+      </w:pPr>
+      <w:r>
+        <w:rPr/>
+        <w:t>Які завдання розв’язуються в процесі синтаксичного аналізу?</w:t>
+      </w:r>
+    </w:p>
+    <w:p>
+      <w:pPr>
+        <w:pStyle w:val="P1"/>
+        <w:rPr/>
+      </w:pPr>
+      <w:r>
+        <w:rPr/>
+      </w:r>
+    </w:p>
+    <w:p>
+      <w:pPr>
+        <w:pStyle w:val="P1"/>
+        <w:rPr/>
+      </w:pPr>
+      <w:r>
+        <w:rPr/>
+        <w:t>Основним завданням є перевірка структури тексту, чи відповідає вона правилам мови.</w:t>
+      </w:r>
+    </w:p>
+    <w:p>
+      <w:pPr>
+        <w:pStyle w:val="P1"/>
+        <w:rPr/>
+      </w:pPr>
+      <w:r>
+        <w:rPr/>
+      </w:r>
+    </w:p>
+    <w:p>
+      <w:pPr>
+        <w:pStyle w:val="H2"/>
+        <w:rPr/>
+      </w:pPr>
+      <w:r>
+        <w:rPr/>
+        <w:t>Що таке контекстно-вільна граматика?</w:t>
+      </w:r>
+    </w:p>
+    <w:p>
+      <w:pPr>
+        <w:pStyle w:val="P1"/>
+        <w:rPr/>
+      </w:pPr>
+      <w:r>
+        <w:rPr/>
+      </w:r>
+    </w:p>
+    <w:p>
+      <w:pPr>
+        <w:pStyle w:val="P1"/>
+        <w:rPr/>
+      </w:pPr>
+      <w:r>
+        <w:rPr/>
+        <w:t>Набір формальних правил, які визначають як будуються речення в мові.</w:t>
+      </w:r>
+    </w:p>
+    <w:p>
+      <w:pPr>
+        <w:pStyle w:val="P1"/>
+        <w:rPr/>
+      </w:pPr>
+      <w:r>
+        <w:rPr/>
+      </w:r>
+    </w:p>
+    <w:p>
+      <w:pPr>
+        <w:pStyle w:val="H2"/>
+        <w:rPr/>
+      </w:pPr>
+      <w:r>
+        <w:rPr/>
+        <w:t>Чим відрізняється та в чому полягають низхідний та висхідний синтаксичний аналіз?</w:t>
+      </w:r>
+    </w:p>
+    <w:p>
+      <w:pPr>
+        <w:pStyle w:val="P1"/>
+        <w:rPr/>
+      </w:pPr>
+      <w:r>
+        <w:rPr/>
+      </w:r>
+    </w:p>
+    <w:p>
+      <w:pPr>
+        <w:pStyle w:val="P1"/>
+        <w:rPr/>
+      </w:pPr>
+      <w:r>
+        <w:rPr/>
+        <w:t>Низхідний будує дерево від кореня до листів.</w:t>
+      </w:r>
+    </w:p>
+    <w:p>
+      <w:pPr>
+        <w:pStyle w:val="P1"/>
+        <w:rPr/>
+      </w:pPr>
+      <w:r>
+        <w:rPr/>
+        <w:t>Висхідний будує від листя до кореня.</w:t>
       </w:r>
     </w:p>
     <w:sectPr>

</xml_diff>